<commit_message>
se realizó correcciones esteticas y se añadió bibliografia
</commit_message>
<xml_diff>
--- a/Actividad 1 - DSI.docx
+++ b/Actividad 1 - DSI.docx
@@ -5,166 +5,184 @@
     <w:p>
       <w:pPr>
         <w:spacing w:line="276" w:lineRule="auto"/>
-        <w:rPr>
-          <w:rFonts w:ascii="Times New Roman" w:hAnsi="Times New Roman" w:cs="Times New Roman"/>
-          <w:b/>
-          <w:bCs/>
-        </w:rPr>
-      </w:pPr>
-      <w:r>
-        <w:rPr>
-          <w:rFonts w:ascii="Times New Roman" w:hAnsi="Times New Roman" w:cs="Times New Roman"/>
-          <w:b/>
-          <w:bCs/>
-        </w:rPr>
-        <w:t>1</w:t>
-      </w:r>
-      <w:r>
-        <w:rPr>
-          <w:rFonts w:ascii="Times New Roman" w:hAnsi="Times New Roman" w:cs="Times New Roman"/>
-          <w:b/>
-          <w:bCs/>
+        <w:jc w:val="both"/>
+        <w:rPr>
+          <w:rFonts w:ascii="Times New Roman" w:hAnsi="Times New Roman" w:cs="Times New Roman"/>
+          <w:b/>
+          <w:bCs/>
+        </w:rPr>
+      </w:pPr>
+      <w:r>
+        <w:rPr>
+          <w:rFonts w:ascii="Times New Roman" w:hAnsi="Times New Roman" w:cs="Times New Roman"/>
+          <w:b/>
+          <w:bCs/>
+        </w:rPr>
+        <w:t>1. Introducción</w:t>
+      </w:r>
+    </w:p>
+    <w:p>
+      <w:pPr>
+        <w:spacing w:line="276" w:lineRule="auto"/>
+        <w:jc w:val="both"/>
+        <w:rPr>
+          <w:rFonts w:ascii="Times New Roman" w:hAnsi="Times New Roman" w:cs="Times New Roman"/>
+        </w:rPr>
+      </w:pPr>
+      <w:r>
+        <w:rPr>
+          <w:rFonts w:ascii="Times New Roman" w:hAnsi="Times New Roman" w:cs="Times New Roman"/>
+        </w:rPr>
+        <w:t>El rescate de animales requiere organizar información sobre los casos registrados, los responsables asignados y la atención que recibe cada animal. Cuando estos datos no se gestionan adecuadamente, puede resultar difícil conocer el estado de cada caso y dar seguimiento a su proceso.</w:t>
+      </w:r>
+    </w:p>
+    <w:p>
+      <w:pPr>
+        <w:spacing w:line="276" w:lineRule="auto"/>
+        <w:jc w:val="both"/>
+        <w:rPr>
+          <w:rFonts w:ascii="Times New Roman" w:hAnsi="Times New Roman" w:cs="Times New Roman"/>
+        </w:rPr>
+      </w:pPr>
+      <w:r>
+        <w:rPr>
+          <w:rFonts w:ascii="Times New Roman" w:hAnsi="Times New Roman" w:cs="Times New Roman"/>
+        </w:rPr>
+        <w:t>Por esta razón, se propone el diseño de un sistema para gestionar los casos de rescate de perros, gatos y animales silvestres. El sistema permitirá registrar los casos, asignar responsables, actualizar estados y organizar la información relacionada con la atención veterinaria y las adopciones.</w:t>
+      </w:r>
+    </w:p>
+    <w:p>
+      <w:pPr>
+        <w:spacing w:line="276" w:lineRule="auto"/>
+        <w:jc w:val="both"/>
+        <w:rPr>
+          <w:rFonts w:ascii="Times New Roman" w:hAnsi="Times New Roman" w:cs="Times New Roman"/>
+        </w:rPr>
+      </w:pPr>
+      <w:r>
+        <w:rPr>
+          <w:rFonts w:ascii="Times New Roman" w:hAnsi="Times New Roman" w:cs="Times New Roman"/>
+        </w:rPr>
+        <w:t>Para representar el funcionamiento y la estructura del sistema se utilizará el Lenguaje Unificado de Modelado (UML), que permite visualizar y documentar el diseño de un sistema mediante diferentes tipos de diagramas (</w:t>
+      </w:r>
+      <w:proofErr w:type="spellStart"/>
+      <w:r>
+        <w:rPr>
+          <w:rFonts w:ascii="Times New Roman" w:hAnsi="Times New Roman" w:cs="Times New Roman"/>
+        </w:rPr>
+        <w:t>Object</w:t>
+      </w:r>
+      <w:proofErr w:type="spellEnd"/>
+      <w:r>
+        <w:rPr>
+          <w:rFonts w:ascii="Times New Roman" w:hAnsi="Times New Roman" w:cs="Times New Roman"/>
+        </w:rPr>
+        <w:t xml:space="preserve"> Management Group [OMG], </w:t>
+      </w:r>
+      <w:r>
+        <w:rPr>
+          <w:rFonts w:ascii="Times New Roman" w:hAnsi="Times New Roman" w:cs="Times New Roman"/>
+        </w:rPr>
+        <w:t>2017</w:t>
+      </w:r>
+      <w:r>
+        <w:rPr>
+          <w:rFonts w:ascii="Times New Roman" w:hAnsi="Times New Roman" w:cs="Times New Roman"/>
+        </w:rPr>
+        <w:t xml:space="preserve">). También se considerarán patrones de diseño, que ofrecen soluciones reutilizables para problemas frecuentes en el desarrollo de software (Gamma et al., 1994). Finalmente, se utilizará </w:t>
+      </w:r>
+      <w:proofErr w:type="spellStart"/>
+      <w:r>
+        <w:rPr>
+          <w:rFonts w:ascii="Times New Roman" w:hAnsi="Times New Roman" w:cs="Times New Roman"/>
+        </w:rPr>
+        <w:t>Gitflow</w:t>
+      </w:r>
+      <w:proofErr w:type="spellEnd"/>
+      <w:r>
+        <w:rPr>
+          <w:rFonts w:ascii="Times New Roman" w:hAnsi="Times New Roman" w:cs="Times New Roman"/>
+        </w:rPr>
+        <w:t xml:space="preserve"> para organizar los avances del diseño mediante un repositorio de GitHub.</w:t>
+      </w:r>
+    </w:p>
+    <w:p>
+      <w:pPr>
+        <w:spacing w:line="276" w:lineRule="auto"/>
+        <w:jc w:val="both"/>
+        <w:rPr>
+          <w:rFonts w:ascii="Times New Roman" w:hAnsi="Times New Roman" w:cs="Times New Roman"/>
+        </w:rPr>
+      </w:pPr>
+    </w:p>
+    <w:p>
+      <w:pPr>
+        <w:spacing w:line="276" w:lineRule="auto"/>
+        <w:jc w:val="both"/>
+        <w:rPr>
+          <w:rFonts w:ascii="Times New Roman" w:hAnsi="Times New Roman" w:cs="Times New Roman"/>
+        </w:rPr>
+      </w:pPr>
+    </w:p>
+    <w:p>
+      <w:pPr>
+        <w:spacing w:line="276" w:lineRule="auto"/>
+        <w:jc w:val="both"/>
+        <w:rPr>
+          <w:rFonts w:ascii="Times New Roman" w:hAnsi="Times New Roman" w:cs="Times New Roman"/>
+          <w:b/>
+          <w:bCs/>
+        </w:rPr>
+      </w:pPr>
+      <w:r>
+        <w:rPr>
+          <w:rFonts w:ascii="Times New Roman" w:hAnsi="Times New Roman" w:cs="Times New Roman"/>
+          <w:b/>
+          <w:bCs/>
+        </w:rPr>
+        <w:t>2. Análisis del escenario</w:t>
+      </w:r>
+    </w:p>
+    <w:p>
+      <w:pPr>
+        <w:spacing w:line="276" w:lineRule="auto"/>
+        <w:jc w:val="both"/>
+        <w:rPr>
+          <w:rFonts w:ascii="Times New Roman" w:hAnsi="Times New Roman" w:cs="Times New Roman"/>
+        </w:rPr>
+      </w:pPr>
+      <w:r>
+        <w:rPr>
+          <w:rFonts w:ascii="Times New Roman" w:hAnsi="Times New Roman" w:cs="Times New Roman"/>
+        </w:rPr>
+        <w:t xml:space="preserve">El sistema propuesto busca facilitar el registro y seguimiento de los animales rescatados, desde la creación del caso hasta su atención, adopción o liberación, cuando corresponda. Para definir su funcionamiento, se identifican los usuarios que interactuarán con el sistema y las funciones que deberá ofrecer. Los requerimientos permiten establecer estas necesidades y sirven como base para el diseño del software </w:t>
+      </w:r>
+      <w:r>
+        <w:rPr>
+          <w:rFonts w:ascii="Times New Roman" w:hAnsi="Times New Roman" w:cs="Times New Roman"/>
+        </w:rPr>
+        <w:t>(Haigh, 2023)</w:t>
+      </w:r>
+      <w:r>
+        <w:rPr>
+          <w:rFonts w:ascii="Times New Roman" w:hAnsi="Times New Roman" w:cs="Times New Roman"/>
         </w:rPr>
         <w:t>.</w:t>
       </w:r>
-      <w:r>
-        <w:rPr>
-          <w:rFonts w:ascii="Times New Roman" w:hAnsi="Times New Roman" w:cs="Times New Roman"/>
-          <w:b/>
-          <w:bCs/>
-        </w:rPr>
-        <w:t xml:space="preserve"> </w:t>
-      </w:r>
-      <w:r>
-        <w:rPr>
-          <w:rFonts w:ascii="Times New Roman" w:hAnsi="Times New Roman" w:cs="Times New Roman"/>
-          <w:b/>
-          <w:bCs/>
-        </w:rPr>
-        <w:t>Introducción</w:t>
-      </w:r>
-    </w:p>
-    <w:p>
-      <w:pPr>
-        <w:spacing w:line="276" w:lineRule="auto"/>
-        <w:rPr>
-          <w:rFonts w:ascii="Times New Roman" w:hAnsi="Times New Roman" w:cs="Times New Roman"/>
-        </w:rPr>
-      </w:pPr>
-      <w:r>
-        <w:rPr>
-          <w:rFonts w:ascii="Times New Roman" w:hAnsi="Times New Roman" w:cs="Times New Roman"/>
-        </w:rPr>
-        <w:t>El rescate de animales requiere organizar información sobre los casos registrados, los responsables asignados y la atención que recibe cada animal. Cuando estos datos no se gestionan adecuadamente, puede resultar difícil conocer el estado de cada caso y dar seguimiento a su proceso.</w:t>
-      </w:r>
-    </w:p>
-    <w:p>
-      <w:pPr>
-        <w:spacing w:line="276" w:lineRule="auto"/>
-        <w:rPr>
-          <w:rFonts w:ascii="Times New Roman" w:hAnsi="Times New Roman" w:cs="Times New Roman"/>
-        </w:rPr>
-      </w:pPr>
-      <w:r>
-        <w:rPr>
-          <w:rFonts w:ascii="Times New Roman" w:hAnsi="Times New Roman" w:cs="Times New Roman"/>
-        </w:rPr>
-        <w:t>Por esta razón, se propone el diseño de un sistema para gestionar los casos de rescate de perros, gatos y animales silvestres. El sistema permitirá registrar los casos, asignar responsables, actualizar estados y organizar la información relacionada con la atención veterinaria y las adopciones.</w:t>
-      </w:r>
-    </w:p>
-    <w:p>
-      <w:pPr>
-        <w:spacing w:line="276" w:lineRule="auto"/>
-        <w:rPr>
-          <w:rFonts w:ascii="Times New Roman" w:hAnsi="Times New Roman" w:cs="Times New Roman"/>
-        </w:rPr>
-      </w:pPr>
-      <w:r>
-        <w:rPr>
-          <w:rFonts w:ascii="Times New Roman" w:hAnsi="Times New Roman" w:cs="Times New Roman"/>
-        </w:rPr>
-        <w:t>Para representar el funcionamiento y la estructura del sistema se utilizará el Lenguaje Unificado de Modelado (UML), que permite visualizar y documentar el diseño de un sistema mediante diferentes tipos de diagramas (</w:t>
-      </w:r>
-      <w:proofErr w:type="spellStart"/>
-      <w:r>
-        <w:rPr>
-          <w:rFonts w:ascii="Times New Roman" w:hAnsi="Times New Roman" w:cs="Times New Roman"/>
-        </w:rPr>
-        <w:t>Object</w:t>
-      </w:r>
-      <w:proofErr w:type="spellEnd"/>
-      <w:r>
-        <w:rPr>
-          <w:rFonts w:ascii="Times New Roman" w:hAnsi="Times New Roman" w:cs="Times New Roman"/>
-        </w:rPr>
-        <w:t xml:space="preserve"> Management Group [OMG], s. f.). También se considerarán patrones de diseño, que ofrecen soluciones reutilizables para problemas frecuentes en el desarrollo de software (Gamma et al., 1994). Finalmente, se utilizará </w:t>
-      </w:r>
-      <w:proofErr w:type="spellStart"/>
-      <w:r>
-        <w:rPr>
-          <w:rFonts w:ascii="Times New Roman" w:hAnsi="Times New Roman" w:cs="Times New Roman"/>
-        </w:rPr>
-        <w:t>Gitflow</w:t>
-      </w:r>
-      <w:proofErr w:type="spellEnd"/>
-      <w:r>
-        <w:rPr>
-          <w:rFonts w:ascii="Times New Roman" w:hAnsi="Times New Roman" w:cs="Times New Roman"/>
-        </w:rPr>
-        <w:t xml:space="preserve"> para organizar los avances del diseño mediante un repositorio de GitHub.</w:t>
-      </w:r>
-    </w:p>
-    <w:p>
-      <w:pPr>
-        <w:spacing w:line="276" w:lineRule="auto"/>
-        <w:rPr>
-          <w:rFonts w:ascii="Times New Roman" w:hAnsi="Times New Roman" w:cs="Times New Roman"/>
-        </w:rPr>
-      </w:pPr>
-    </w:p>
-    <w:p>
-      <w:pPr>
-        <w:spacing w:line="276" w:lineRule="auto"/>
-        <w:rPr>
-          <w:rFonts w:ascii="Times New Roman" w:hAnsi="Times New Roman" w:cs="Times New Roman"/>
-        </w:rPr>
-      </w:pPr>
-    </w:p>
-    <w:p>
-      <w:pPr>
-        <w:spacing w:line="276" w:lineRule="auto"/>
-        <w:rPr>
-          <w:rFonts w:ascii="Times New Roman" w:hAnsi="Times New Roman" w:cs="Times New Roman"/>
-          <w:b/>
-          <w:bCs/>
-        </w:rPr>
-      </w:pPr>
-      <w:r>
-        <w:rPr>
-          <w:rFonts w:ascii="Times New Roman" w:hAnsi="Times New Roman" w:cs="Times New Roman"/>
-          <w:b/>
-          <w:bCs/>
-        </w:rPr>
-        <w:t>2. Análisis del escenario</w:t>
-      </w:r>
-    </w:p>
-    <w:p>
-      <w:pPr>
-        <w:spacing w:line="276" w:lineRule="auto"/>
-        <w:rPr>
-          <w:rFonts w:ascii="Times New Roman" w:hAnsi="Times New Roman" w:cs="Times New Roman"/>
-        </w:rPr>
-      </w:pPr>
-      <w:r>
-        <w:rPr>
-          <w:rFonts w:ascii="Times New Roman" w:hAnsi="Times New Roman" w:cs="Times New Roman"/>
-        </w:rPr>
-        <w:t>El sistema propuesto busca facilitar el registro y seguimiento de los animales rescatados, desde la creación del caso hasta su atención, adopción o liberación, cuando corresponda. Para definir su funcionamiento, se identifican los usuarios que interactuarán con el sistema y las funciones que deberá ofrecer. Los requerimientos permiten establecer estas necesidades y sirven como base para el diseño del software (NASA, s. f.).</w:t>
-      </w:r>
-    </w:p>
-    <w:p>
-      <w:pPr>
-        <w:spacing w:line="276" w:lineRule="auto"/>
+    </w:p>
+    <w:p>
+      <w:pPr>
+        <w:spacing w:line="276" w:lineRule="auto"/>
+        <w:jc w:val="both"/>
+        <w:rPr>
+          <w:rFonts w:ascii="Times New Roman" w:hAnsi="Times New Roman" w:cs="Times New Roman"/>
+        </w:rPr>
+      </w:pPr>
+    </w:p>
+    <w:p>
+      <w:pPr>
+        <w:spacing w:line="276" w:lineRule="auto"/>
+        <w:jc w:val="both"/>
         <w:rPr>
           <w:rFonts w:ascii="Times New Roman" w:hAnsi="Times New Roman" w:cs="Times New Roman"/>
           <w:b/>
@@ -183,6 +201,7 @@
     <w:p>
       <w:pPr>
         <w:spacing w:line="276" w:lineRule="auto"/>
+        <w:jc w:val="both"/>
         <w:rPr>
           <w:rFonts w:ascii="Times New Roman" w:hAnsi="Times New Roman" w:cs="Times New Roman"/>
         </w:rPr>
@@ -201,6 +220,7 @@
           <w:numId w:val="2"/>
         </w:numPr>
         <w:spacing w:line="276" w:lineRule="auto"/>
+        <w:jc w:val="both"/>
         <w:rPr>
           <w:rFonts w:ascii="Times New Roman" w:hAnsi="Times New Roman" w:cs="Times New Roman"/>
         </w:rPr>
@@ -245,6 +265,7 @@
           <w:numId w:val="2"/>
         </w:numPr>
         <w:spacing w:line="276" w:lineRule="auto"/>
+        <w:jc w:val="both"/>
         <w:rPr>
           <w:rFonts w:ascii="Times New Roman" w:hAnsi="Times New Roman" w:cs="Times New Roman"/>
         </w:rPr>
@@ -271,6 +292,7 @@
           <w:numId w:val="2"/>
         </w:numPr>
         <w:spacing w:line="276" w:lineRule="auto"/>
+        <w:jc w:val="both"/>
         <w:rPr>
           <w:rFonts w:ascii="Times New Roman" w:hAnsi="Times New Roman" w:cs="Times New Roman"/>
         </w:rPr>
@@ -297,6 +319,7 @@
           <w:numId w:val="2"/>
         </w:numPr>
         <w:spacing w:line="276" w:lineRule="auto"/>
+        <w:jc w:val="both"/>
         <w:rPr>
           <w:rFonts w:ascii="Times New Roman" w:hAnsi="Times New Roman" w:cs="Times New Roman"/>
         </w:rPr>
@@ -323,6 +346,7 @@
           <w:numId w:val="2"/>
         </w:numPr>
         <w:spacing w:line="276" w:lineRule="auto"/>
+        <w:jc w:val="both"/>
         <w:rPr>
           <w:rFonts w:ascii="Times New Roman" w:hAnsi="Times New Roman" w:cs="Times New Roman"/>
         </w:rPr>
@@ -345,34 +369,59 @@
     <w:p>
       <w:pPr>
         <w:spacing w:line="276" w:lineRule="auto"/>
-        <w:rPr>
-          <w:rFonts w:ascii="Times New Roman" w:hAnsi="Times New Roman" w:cs="Times New Roman"/>
-          <w:b/>
-          <w:bCs/>
-        </w:rPr>
-      </w:pPr>
-      <w:r>
-        <w:rPr>
-          <w:rFonts w:ascii="Times New Roman" w:hAnsi="Times New Roman" w:cs="Times New Roman"/>
-          <w:b/>
-          <w:bCs/>
-        </w:rPr>
+        <w:jc w:val="both"/>
+        <w:rPr>
+          <w:rFonts w:ascii="Times New Roman" w:hAnsi="Times New Roman" w:cs="Times New Roman"/>
+          <w:b/>
+          <w:bCs/>
+        </w:rPr>
+      </w:pPr>
+    </w:p>
+    <w:p>
+      <w:pPr>
+        <w:spacing w:line="276" w:lineRule="auto"/>
+        <w:jc w:val="both"/>
+        <w:rPr>
+          <w:rFonts w:ascii="Times New Roman" w:hAnsi="Times New Roman" w:cs="Times New Roman"/>
+          <w:b/>
+          <w:bCs/>
+        </w:rPr>
+      </w:pPr>
+      <w:r>
+        <w:rPr>
+          <w:rFonts w:ascii="Times New Roman" w:hAnsi="Times New Roman" w:cs="Times New Roman"/>
+          <w:b/>
+          <w:bCs/>
+        </w:rPr>
+        <w:lastRenderedPageBreak/>
         <w:t>2.2 Requerimientos funcionales</w:t>
       </w:r>
     </w:p>
     <w:p>
       <w:pPr>
         <w:spacing w:line="276" w:lineRule="auto"/>
-        <w:rPr>
-          <w:rFonts w:ascii="Times New Roman" w:hAnsi="Times New Roman" w:cs="Times New Roman"/>
-        </w:rPr>
-      </w:pPr>
-      <w:r>
-        <w:rPr>
-          <w:rFonts w:ascii="Times New Roman" w:hAnsi="Times New Roman" w:cs="Times New Roman"/>
-        </w:rPr>
-        <w:lastRenderedPageBreak/>
-        <w:t>Los requerimientos funcionales describen las acciones que el sistema debe permitir realizar (NASA, s. f.). Para este proyecto se proponen los siguientes:</w:t>
+        <w:jc w:val="both"/>
+        <w:rPr>
+          <w:rFonts w:ascii="Times New Roman" w:hAnsi="Times New Roman" w:cs="Times New Roman"/>
+        </w:rPr>
+      </w:pPr>
+      <w:r>
+        <w:rPr>
+          <w:rFonts w:ascii="Times New Roman" w:hAnsi="Times New Roman" w:cs="Times New Roman"/>
+        </w:rPr>
+        <w:t xml:space="preserve">Los requerimientos funcionales describen las acciones que el sistema debe permitir realizar </w:t>
+      </w:r>
+      <w:r>
+        <w:rPr>
+          <w:rFonts w:ascii="Times New Roman" w:hAnsi="Times New Roman" w:cs="Times New Roman"/>
+        </w:rPr>
+        <w:t>(Haigh, 2023)</w:t>
+      </w:r>
+      <w:r>
+        <w:rPr>
+          <w:rFonts w:ascii="Times New Roman" w:hAnsi="Times New Roman" w:cs="Times New Roman"/>
+        </w:rPr>
+        <w:t>. Para este proyecto se proponen los siguientes:</w:t>
       </w:r>
     </w:p>
     <w:p>
@@ -382,6 +431,7 @@
           <w:numId w:val="3"/>
         </w:numPr>
         <w:spacing w:line="276" w:lineRule="auto"/>
+        <w:jc w:val="both"/>
         <w:rPr>
           <w:rFonts w:ascii="Times New Roman" w:hAnsi="Times New Roman" w:cs="Times New Roman"/>
         </w:rPr>
@@ -408,6 +458,7 @@
           <w:numId w:val="3"/>
         </w:numPr>
         <w:spacing w:line="276" w:lineRule="auto"/>
+        <w:jc w:val="both"/>
         <w:rPr>
           <w:rFonts w:ascii="Times New Roman" w:hAnsi="Times New Roman" w:cs="Times New Roman"/>
         </w:rPr>
@@ -434,6 +485,7 @@
           <w:numId w:val="3"/>
         </w:numPr>
         <w:spacing w:line="276" w:lineRule="auto"/>
+        <w:jc w:val="both"/>
         <w:rPr>
           <w:rFonts w:ascii="Times New Roman" w:hAnsi="Times New Roman" w:cs="Times New Roman"/>
         </w:rPr>
@@ -460,6 +512,7 @@
           <w:numId w:val="3"/>
         </w:numPr>
         <w:spacing w:line="276" w:lineRule="auto"/>
+        <w:jc w:val="both"/>
         <w:rPr>
           <w:rFonts w:ascii="Times New Roman" w:hAnsi="Times New Roman" w:cs="Times New Roman"/>
         </w:rPr>
@@ -486,6 +539,7 @@
           <w:numId w:val="3"/>
         </w:numPr>
         <w:spacing w:line="276" w:lineRule="auto"/>
+        <w:jc w:val="both"/>
         <w:rPr>
           <w:rFonts w:ascii="Times New Roman" w:hAnsi="Times New Roman" w:cs="Times New Roman"/>
         </w:rPr>
@@ -512,6 +566,7 @@
           <w:numId w:val="3"/>
         </w:numPr>
         <w:spacing w:line="276" w:lineRule="auto"/>
+        <w:jc w:val="both"/>
         <w:rPr>
           <w:rFonts w:ascii="Times New Roman" w:hAnsi="Times New Roman" w:cs="Times New Roman"/>
         </w:rPr>
@@ -538,6 +593,7 @@
           <w:numId w:val="3"/>
         </w:numPr>
         <w:spacing w:line="276" w:lineRule="auto"/>
+        <w:jc w:val="both"/>
         <w:rPr>
           <w:rFonts w:ascii="Times New Roman" w:hAnsi="Times New Roman" w:cs="Times New Roman"/>
         </w:rPr>
@@ -564,6 +620,7 @@
           <w:numId w:val="3"/>
         </w:numPr>
         <w:spacing w:line="276" w:lineRule="auto"/>
+        <w:jc w:val="both"/>
         <w:rPr>
           <w:rFonts w:ascii="Times New Roman" w:hAnsi="Times New Roman" w:cs="Times New Roman"/>
         </w:rPr>
@@ -586,6 +643,18 @@
     <w:p>
       <w:pPr>
         <w:spacing w:line="276" w:lineRule="auto"/>
+        <w:jc w:val="both"/>
+        <w:rPr>
+          <w:rFonts w:ascii="Times New Roman" w:hAnsi="Times New Roman" w:cs="Times New Roman"/>
+          <w:b/>
+          <w:bCs/>
+        </w:rPr>
+      </w:pPr>
+    </w:p>
+    <w:p>
+      <w:pPr>
+        <w:spacing w:line="276" w:lineRule="auto"/>
+        <w:jc w:val="both"/>
         <w:rPr>
           <w:rFonts w:ascii="Times New Roman" w:hAnsi="Times New Roman" w:cs="Times New Roman"/>
           <w:b/>
@@ -604,15 +673,28 @@
     <w:p>
       <w:pPr>
         <w:spacing w:line="276" w:lineRule="auto"/>
-        <w:rPr>
-          <w:rFonts w:ascii="Times New Roman" w:hAnsi="Times New Roman" w:cs="Times New Roman"/>
-        </w:rPr>
-      </w:pPr>
-      <w:r>
-        <w:rPr>
-          <w:rFonts w:ascii="Times New Roman" w:hAnsi="Times New Roman" w:cs="Times New Roman"/>
-        </w:rPr>
-        <w:t>Los requerimientos no funcionales describen características de calidad y condiciones que debe cumplir el sistema, además de las funciones que realiza (NASA, s. f.). Para esta propuesta se consideran los siguientes:</w:t>
+        <w:jc w:val="both"/>
+        <w:rPr>
+          <w:rFonts w:ascii="Times New Roman" w:hAnsi="Times New Roman" w:cs="Times New Roman"/>
+        </w:rPr>
+      </w:pPr>
+      <w:r>
+        <w:rPr>
+          <w:rFonts w:ascii="Times New Roman" w:hAnsi="Times New Roman" w:cs="Times New Roman"/>
+        </w:rPr>
+        <w:t xml:space="preserve">Los requerimientos no funcionales describen características de calidad y condiciones que debe cumplir el sistema, además de las funciones que realiza </w:t>
+      </w:r>
+      <w:r>
+        <w:rPr>
+          <w:rFonts w:ascii="Times New Roman" w:hAnsi="Times New Roman" w:cs="Times New Roman"/>
+        </w:rPr>
+        <w:t>(Haigh, 2023)</w:t>
+      </w:r>
+      <w:r>
+        <w:rPr>
+          <w:rFonts w:ascii="Times New Roman" w:hAnsi="Times New Roman" w:cs="Times New Roman"/>
+        </w:rPr>
+        <w:t>. Para esta propuesta se consideran los siguientes:</w:t>
       </w:r>
     </w:p>
     <w:p>
@@ -622,6 +704,7 @@
           <w:numId w:val="4"/>
         </w:numPr>
         <w:spacing w:line="276" w:lineRule="auto"/>
+        <w:jc w:val="both"/>
         <w:rPr>
           <w:rFonts w:ascii="Times New Roman" w:hAnsi="Times New Roman" w:cs="Times New Roman"/>
         </w:rPr>
@@ -648,6 +731,7 @@
           <w:numId w:val="4"/>
         </w:numPr>
         <w:spacing w:line="276" w:lineRule="auto"/>
+        <w:jc w:val="both"/>
         <w:rPr>
           <w:rFonts w:ascii="Times New Roman" w:hAnsi="Times New Roman" w:cs="Times New Roman"/>
         </w:rPr>
@@ -674,6 +758,7 @@
           <w:numId w:val="4"/>
         </w:numPr>
         <w:spacing w:line="276" w:lineRule="auto"/>
+        <w:jc w:val="both"/>
         <w:rPr>
           <w:rFonts w:ascii="Times New Roman" w:hAnsi="Times New Roman" w:cs="Times New Roman"/>
         </w:rPr>
@@ -700,6 +785,7 @@
           <w:numId w:val="4"/>
         </w:numPr>
         <w:spacing w:line="276" w:lineRule="auto"/>
+        <w:jc w:val="both"/>
         <w:rPr>
           <w:rFonts w:ascii="Times New Roman" w:hAnsi="Times New Roman" w:cs="Times New Roman"/>
         </w:rPr>
@@ -722,72 +808,99 @@
     <w:p>
       <w:pPr>
         <w:spacing w:line="276" w:lineRule="auto"/>
-        <w:rPr>
-          <w:rFonts w:ascii="Times New Roman" w:hAnsi="Times New Roman" w:cs="Times New Roman"/>
-        </w:rPr>
-      </w:pPr>
-    </w:p>
-    <w:p>
-      <w:pPr>
-        <w:spacing w:line="276" w:lineRule="auto"/>
-        <w:rPr>
-          <w:rFonts w:ascii="Times New Roman" w:hAnsi="Times New Roman" w:cs="Times New Roman"/>
-        </w:rPr>
-      </w:pPr>
-    </w:p>
-    <w:p>
-      <w:pPr>
-        <w:spacing w:line="276" w:lineRule="auto"/>
-        <w:rPr>
-          <w:rFonts w:ascii="Times New Roman" w:hAnsi="Times New Roman" w:cs="Times New Roman"/>
-        </w:rPr>
-      </w:pPr>
-    </w:p>
-    <w:p>
-      <w:pPr>
-        <w:spacing w:line="276" w:lineRule="auto"/>
-        <w:rPr>
-          <w:rFonts w:ascii="Times New Roman" w:hAnsi="Times New Roman" w:cs="Times New Roman"/>
-        </w:rPr>
-      </w:pPr>
-    </w:p>
-    <w:p>
-      <w:pPr>
-        <w:spacing w:line="276" w:lineRule="auto"/>
-        <w:rPr>
-          <w:rFonts w:ascii="Times New Roman" w:hAnsi="Times New Roman" w:cs="Times New Roman"/>
-        </w:rPr>
-      </w:pPr>
-    </w:p>
-    <w:p>
-      <w:pPr>
-        <w:spacing w:line="276" w:lineRule="auto"/>
-        <w:rPr>
-          <w:rFonts w:ascii="Times New Roman" w:hAnsi="Times New Roman" w:cs="Times New Roman"/>
-        </w:rPr>
-      </w:pPr>
-    </w:p>
-    <w:p>
-      <w:pPr>
-        <w:spacing w:line="276" w:lineRule="auto"/>
-        <w:rPr>
-          <w:rFonts w:ascii="Times New Roman" w:hAnsi="Times New Roman" w:cs="Times New Roman"/>
-          <w:b/>
-          <w:bCs/>
-        </w:rPr>
-      </w:pPr>
-      <w:r>
-        <w:rPr>
-          <w:rFonts w:ascii="Times New Roman" w:hAnsi="Times New Roman" w:cs="Times New Roman"/>
-          <w:b/>
-          <w:bCs/>
-        </w:rPr>
+        <w:jc w:val="both"/>
+        <w:rPr>
+          <w:rFonts w:ascii="Times New Roman" w:hAnsi="Times New Roman" w:cs="Times New Roman"/>
+        </w:rPr>
+      </w:pPr>
+    </w:p>
+    <w:p>
+      <w:pPr>
+        <w:spacing w:line="276" w:lineRule="auto"/>
+        <w:jc w:val="both"/>
+        <w:rPr>
+          <w:rFonts w:ascii="Times New Roman" w:hAnsi="Times New Roman" w:cs="Times New Roman"/>
+        </w:rPr>
+      </w:pPr>
+    </w:p>
+    <w:p>
+      <w:pPr>
+        <w:spacing w:line="276" w:lineRule="auto"/>
+        <w:jc w:val="both"/>
+        <w:rPr>
+          <w:rFonts w:ascii="Times New Roman" w:hAnsi="Times New Roman" w:cs="Times New Roman"/>
+        </w:rPr>
+      </w:pPr>
+    </w:p>
+    <w:p>
+      <w:pPr>
+        <w:spacing w:line="276" w:lineRule="auto"/>
+        <w:jc w:val="both"/>
+        <w:rPr>
+          <w:rFonts w:ascii="Times New Roman" w:hAnsi="Times New Roman" w:cs="Times New Roman"/>
+        </w:rPr>
+      </w:pPr>
+    </w:p>
+    <w:p>
+      <w:pPr>
+        <w:spacing w:line="276" w:lineRule="auto"/>
+        <w:jc w:val="both"/>
+        <w:rPr>
+          <w:rFonts w:ascii="Times New Roman" w:hAnsi="Times New Roman" w:cs="Times New Roman"/>
+        </w:rPr>
+      </w:pPr>
+    </w:p>
+    <w:p>
+      <w:pPr>
+        <w:spacing w:line="276" w:lineRule="auto"/>
+        <w:jc w:val="both"/>
+        <w:rPr>
+          <w:rFonts w:ascii="Times New Roman" w:hAnsi="Times New Roman" w:cs="Times New Roman"/>
+        </w:rPr>
+      </w:pPr>
+    </w:p>
+    <w:p>
+      <w:pPr>
+        <w:spacing w:line="276" w:lineRule="auto"/>
+        <w:jc w:val="both"/>
+        <w:rPr>
+          <w:rFonts w:ascii="Times New Roman" w:hAnsi="Times New Roman" w:cs="Times New Roman"/>
+        </w:rPr>
+      </w:pPr>
+    </w:p>
+    <w:p>
+      <w:pPr>
+        <w:spacing w:line="276" w:lineRule="auto"/>
+        <w:jc w:val="both"/>
+        <w:rPr>
+          <w:rFonts w:ascii="Times New Roman" w:hAnsi="Times New Roman" w:cs="Times New Roman"/>
+        </w:rPr>
+      </w:pPr>
+    </w:p>
+    <w:p>
+      <w:pPr>
+        <w:spacing w:line="276" w:lineRule="auto"/>
+        <w:jc w:val="both"/>
+        <w:rPr>
+          <w:rFonts w:ascii="Times New Roman" w:hAnsi="Times New Roman" w:cs="Times New Roman"/>
+          <w:b/>
+          <w:bCs/>
+        </w:rPr>
+      </w:pPr>
+      <w:r>
+        <w:rPr>
+          <w:rFonts w:ascii="Times New Roman" w:hAnsi="Times New Roman" w:cs="Times New Roman"/>
+          <w:b/>
+          <w:bCs/>
+        </w:rPr>
+        <w:lastRenderedPageBreak/>
         <w:t>3. Modelado UML</w:t>
       </w:r>
     </w:p>
     <w:p>
       <w:pPr>
         <w:spacing w:line="276" w:lineRule="auto"/>
+        <w:jc w:val="both"/>
         <w:rPr>
           <w:rFonts w:ascii="Times New Roman" w:hAnsi="Times New Roman" w:cs="Times New Roman"/>
         </w:rPr>
@@ -802,15 +915,25 @@
     <w:p>
       <w:pPr>
         <w:spacing w:line="276" w:lineRule="auto"/>
-        <w:rPr>
-          <w:rFonts w:ascii="Times New Roman" w:hAnsi="Times New Roman" w:cs="Times New Roman"/>
-        </w:rPr>
-      </w:pPr>
-      <w:r>
-        <w:rPr>
-          <w:rFonts w:ascii="Times New Roman" w:hAnsi="Times New Roman" w:cs="Times New Roman"/>
-        </w:rPr>
-        <w:lastRenderedPageBreak/>
+        <w:jc w:val="both"/>
+        <w:rPr>
+          <w:rFonts w:ascii="Times New Roman" w:hAnsi="Times New Roman" w:cs="Times New Roman"/>
+        </w:rPr>
+      </w:pPr>
+    </w:p>
+    <w:p>
+      <w:pPr>
+        <w:spacing w:line="276" w:lineRule="auto"/>
+        <w:jc w:val="both"/>
+        <w:rPr>
+          <w:rFonts w:ascii="Times New Roman" w:hAnsi="Times New Roman" w:cs="Times New Roman"/>
+        </w:rPr>
+      </w:pPr>
+      <w:r>
+        <w:rPr>
+          <w:rFonts w:ascii="Times New Roman" w:hAnsi="Times New Roman" w:cs="Times New Roman"/>
+          <w:noProof/>
+        </w:rPr>
         <w:drawing>
           <wp:inline distT="0" distB="0" distL="0" distR="0" wp14:anchorId="76D46E77" wp14:editId="01C52882">
             <wp:extent cx="5400040" cy="4714875"/>
@@ -851,32 +974,113 @@
     <w:p>
       <w:pPr>
         <w:spacing w:line="276" w:lineRule="auto"/>
-        <w:rPr>
-          <w:rFonts w:ascii="Times New Roman" w:hAnsi="Times New Roman" w:cs="Times New Roman"/>
-        </w:rPr>
-      </w:pPr>
-    </w:p>
-    <w:p>
-      <w:pPr>
-        <w:spacing w:line="276" w:lineRule="auto"/>
-        <w:rPr>
-          <w:rFonts w:ascii="Times New Roman" w:hAnsi="Times New Roman" w:cs="Times New Roman"/>
-          <w:b/>
-          <w:bCs/>
-        </w:rPr>
-      </w:pPr>
-      <w:r>
-        <w:rPr>
-          <w:rFonts w:ascii="Times New Roman" w:hAnsi="Times New Roman" w:cs="Times New Roman"/>
-          <w:b/>
-          <w:bCs/>
-        </w:rPr>
+        <w:jc w:val="both"/>
+        <w:rPr>
+          <w:rFonts w:ascii="Times New Roman" w:hAnsi="Times New Roman" w:cs="Times New Roman"/>
+        </w:rPr>
+      </w:pPr>
+    </w:p>
+    <w:p>
+      <w:pPr>
+        <w:spacing w:line="276" w:lineRule="auto"/>
+        <w:jc w:val="both"/>
+        <w:rPr>
+          <w:rFonts w:ascii="Times New Roman" w:hAnsi="Times New Roman" w:cs="Times New Roman"/>
+          <w:b/>
+          <w:bCs/>
+        </w:rPr>
+      </w:pPr>
+    </w:p>
+    <w:p>
+      <w:pPr>
+        <w:spacing w:line="276" w:lineRule="auto"/>
+        <w:jc w:val="both"/>
+        <w:rPr>
+          <w:rFonts w:ascii="Times New Roman" w:hAnsi="Times New Roman" w:cs="Times New Roman"/>
+          <w:b/>
+          <w:bCs/>
+        </w:rPr>
+      </w:pPr>
+    </w:p>
+    <w:p>
+      <w:pPr>
+        <w:spacing w:line="276" w:lineRule="auto"/>
+        <w:jc w:val="both"/>
+        <w:rPr>
+          <w:rFonts w:ascii="Times New Roman" w:hAnsi="Times New Roman" w:cs="Times New Roman"/>
+          <w:b/>
+          <w:bCs/>
+        </w:rPr>
+      </w:pPr>
+    </w:p>
+    <w:p>
+      <w:pPr>
+        <w:spacing w:line="276" w:lineRule="auto"/>
+        <w:jc w:val="both"/>
+        <w:rPr>
+          <w:rFonts w:ascii="Times New Roman" w:hAnsi="Times New Roman" w:cs="Times New Roman"/>
+          <w:b/>
+          <w:bCs/>
+        </w:rPr>
+      </w:pPr>
+    </w:p>
+    <w:p>
+      <w:pPr>
+        <w:spacing w:line="276" w:lineRule="auto"/>
+        <w:jc w:val="both"/>
+        <w:rPr>
+          <w:rFonts w:ascii="Times New Roman" w:hAnsi="Times New Roman" w:cs="Times New Roman"/>
+          <w:b/>
+          <w:bCs/>
+        </w:rPr>
+      </w:pPr>
+    </w:p>
+    <w:p>
+      <w:pPr>
+        <w:spacing w:line="276" w:lineRule="auto"/>
+        <w:jc w:val="both"/>
+        <w:rPr>
+          <w:rFonts w:ascii="Times New Roman" w:hAnsi="Times New Roman" w:cs="Times New Roman"/>
+          <w:b/>
+          <w:bCs/>
+        </w:rPr>
+      </w:pPr>
+    </w:p>
+    <w:p>
+      <w:pPr>
+        <w:spacing w:line="276" w:lineRule="auto"/>
+        <w:jc w:val="both"/>
+        <w:rPr>
+          <w:rFonts w:ascii="Times New Roman" w:hAnsi="Times New Roman" w:cs="Times New Roman"/>
+          <w:b/>
+          <w:bCs/>
+        </w:rPr>
+      </w:pPr>
+    </w:p>
+    <w:p>
+      <w:pPr>
+        <w:spacing w:line="276" w:lineRule="auto"/>
+        <w:jc w:val="both"/>
+        <w:rPr>
+          <w:rFonts w:ascii="Times New Roman" w:hAnsi="Times New Roman" w:cs="Times New Roman"/>
+          <w:b/>
+          <w:bCs/>
+        </w:rPr>
+      </w:pPr>
+      <w:r>
+        <w:rPr>
+          <w:rFonts w:ascii="Times New Roman" w:hAnsi="Times New Roman" w:cs="Times New Roman"/>
+          <w:b/>
+          <w:bCs/>
+        </w:rPr>
+        <w:lastRenderedPageBreak/>
         <w:t>3.2 Diagrama de clases UML</w:t>
       </w:r>
     </w:p>
     <w:p>
       <w:pPr>
         <w:spacing w:line="276" w:lineRule="auto"/>
+        <w:jc w:val="both"/>
         <w:rPr>
           <w:rFonts w:ascii="Times New Roman" w:hAnsi="Times New Roman" w:cs="Times New Roman"/>
         </w:rPr>
@@ -899,21 +1103,43 @@
         <w:rPr>
           <w:rFonts w:ascii="Times New Roman" w:hAnsi="Times New Roman" w:cs="Times New Roman"/>
         </w:rPr>
-        <w:t xml:space="preserve"> Management Group [OMG], s. f.).</w:t>
-      </w:r>
-    </w:p>
-    <w:p>
-      <w:pPr>
-        <w:spacing w:line="276" w:lineRule="auto"/>
-        <w:rPr>
-          <w:rFonts w:ascii="Times New Roman" w:hAnsi="Times New Roman" w:cs="Times New Roman"/>
-        </w:rPr>
-      </w:pPr>
-      <w:r>
-        <w:rPr>
-          <w:rFonts w:ascii="Times New Roman" w:hAnsi="Times New Roman" w:cs="Times New Roman"/>
-        </w:rPr>
-        <w:lastRenderedPageBreak/>
+        <w:t xml:space="preserve"> Management Group [OMG], </w:t>
+      </w:r>
+      <w:r>
+        <w:rPr>
+          <w:rFonts w:ascii="Times New Roman" w:hAnsi="Times New Roman" w:cs="Times New Roman"/>
+        </w:rPr>
+        <w:t>2017</w:t>
+      </w:r>
+      <w:r>
+        <w:rPr>
+          <w:rFonts w:ascii="Times New Roman" w:hAnsi="Times New Roman" w:cs="Times New Roman"/>
+        </w:rPr>
+        <w:t>).</w:t>
+      </w:r>
+    </w:p>
+    <w:p>
+      <w:pPr>
+        <w:spacing w:line="276" w:lineRule="auto"/>
+        <w:jc w:val="both"/>
+        <w:rPr>
+          <w:rFonts w:ascii="Times New Roman" w:hAnsi="Times New Roman" w:cs="Times New Roman"/>
+        </w:rPr>
+      </w:pPr>
+    </w:p>
+    <w:p>
+      <w:pPr>
+        <w:spacing w:line="276" w:lineRule="auto"/>
+        <w:jc w:val="both"/>
+        <w:rPr>
+          <w:rFonts w:ascii="Times New Roman" w:hAnsi="Times New Roman" w:cs="Times New Roman"/>
+        </w:rPr>
+      </w:pPr>
+      <w:r>
+        <w:rPr>
+          <w:rFonts w:ascii="Times New Roman" w:hAnsi="Times New Roman" w:cs="Times New Roman"/>
+          <w:noProof/>
+        </w:rPr>
         <w:drawing>
           <wp:inline distT="0" distB="0" distL="0" distR="0" wp14:anchorId="021893CA" wp14:editId="0F4D8250">
             <wp:extent cx="5400040" cy="4378960"/>
@@ -954,14 +1180,25 @@
     <w:p>
       <w:pPr>
         <w:spacing w:line="276" w:lineRule="auto"/>
-        <w:rPr>
-          <w:rFonts w:ascii="Times New Roman" w:hAnsi="Times New Roman" w:cs="Times New Roman"/>
-        </w:rPr>
-      </w:pPr>
-    </w:p>
-    <w:p>
-      <w:pPr>
-        <w:spacing w:line="276" w:lineRule="auto"/>
+        <w:jc w:val="both"/>
+        <w:rPr>
+          <w:rFonts w:ascii="Times New Roman" w:hAnsi="Times New Roman" w:cs="Times New Roman"/>
+        </w:rPr>
+      </w:pPr>
+    </w:p>
+    <w:p>
+      <w:pPr>
+        <w:spacing w:line="276" w:lineRule="auto"/>
+        <w:jc w:val="both"/>
+        <w:rPr>
+          <w:rFonts w:ascii="Times New Roman" w:hAnsi="Times New Roman" w:cs="Times New Roman"/>
+        </w:rPr>
+      </w:pPr>
+    </w:p>
+    <w:p>
+      <w:pPr>
+        <w:spacing w:line="276" w:lineRule="auto"/>
+        <w:jc w:val="both"/>
         <w:rPr>
           <w:rFonts w:ascii="Times New Roman" w:hAnsi="Times New Roman" w:cs="Times New Roman"/>
           <w:b/>
@@ -980,6 +1217,7 @@
     <w:p>
       <w:pPr>
         <w:spacing w:line="276" w:lineRule="auto"/>
+        <w:jc w:val="both"/>
         <w:rPr>
           <w:rFonts w:ascii="Times New Roman" w:hAnsi="Times New Roman" w:cs="Times New Roman"/>
         </w:rPr>
@@ -994,6 +1232,7 @@
     <w:p>
       <w:pPr>
         <w:spacing w:line="276" w:lineRule="auto"/>
+        <w:jc w:val="both"/>
         <w:rPr>
           <w:rFonts w:ascii="Times New Roman" w:hAnsi="Times New Roman" w:cs="Times New Roman"/>
           <w:b/>
@@ -1012,20 +1251,29 @@
     <w:p>
       <w:pPr>
         <w:spacing w:line="276" w:lineRule="auto"/>
-        <w:rPr>
-          <w:rFonts w:ascii="Times New Roman" w:hAnsi="Times New Roman" w:cs="Times New Roman"/>
-        </w:rPr>
-      </w:pPr>
-      <w:r>
-        <w:rPr>
-          <w:rFonts w:ascii="Times New Roman" w:hAnsi="Times New Roman" w:cs="Times New Roman"/>
-        </w:rPr>
-        <w:t>Factory Method permite separar la creación de objetos del resto del sistema (Gamma et al., 1994). En el refugio se propone utilizarlo para crear objetos que representen distintos tipos de animales, como perros, gatos y fauna silvestre. De esta manera, se puede organizar la creación de animales sin concentrar esa lógica en la clase que registra los casos.</w:t>
-      </w:r>
-    </w:p>
-    <w:p>
-      <w:pPr>
-        <w:spacing w:line="276" w:lineRule="auto"/>
+        <w:jc w:val="both"/>
+        <w:rPr>
+          <w:rFonts w:ascii="Times New Roman" w:hAnsi="Times New Roman" w:cs="Times New Roman"/>
+        </w:rPr>
+      </w:pPr>
+      <w:r>
+        <w:rPr>
+          <w:rFonts w:ascii="Times New Roman" w:hAnsi="Times New Roman" w:cs="Times New Roman"/>
+        </w:rPr>
+        <w:t xml:space="preserve">Factory Method permite separar la creación de objetos del resto del sistema (Gamma et al., 1994). En el refugio se propone utilizarlo para crear objetos que representen distintos tipos de animales, como perros, gatos y fauna silvestre. De esta manera, se puede </w:t>
+      </w:r>
+      <w:r>
+        <w:rPr>
+          <w:rFonts w:ascii="Times New Roman" w:hAnsi="Times New Roman" w:cs="Times New Roman"/>
+        </w:rPr>
+        <w:lastRenderedPageBreak/>
+        <w:t>organizar la creación de animales sin concentrar esa lógica en la clase que registra los casos.</w:t>
+      </w:r>
+    </w:p>
+    <w:p>
+      <w:pPr>
+        <w:spacing w:line="276" w:lineRule="auto"/>
+        <w:jc w:val="both"/>
         <w:rPr>
           <w:rFonts w:ascii="Times New Roman" w:hAnsi="Times New Roman" w:cs="Times New Roman"/>
           <w:b/>
@@ -1062,6 +1310,7 @@
     <w:p>
       <w:pPr>
         <w:spacing w:line="276" w:lineRule="auto"/>
+        <w:jc w:val="both"/>
         <w:rPr>
           <w:rFonts w:ascii="Times New Roman" w:hAnsi="Times New Roman" w:cs="Times New Roman"/>
         </w:rPr>
@@ -1084,19 +1333,19 @@
     <w:p>
       <w:pPr>
         <w:spacing w:line="276" w:lineRule="auto"/>
-        <w:rPr>
-          <w:rFonts w:ascii="Times New Roman" w:hAnsi="Times New Roman" w:cs="Times New Roman"/>
-          <w:b/>
-          <w:bCs/>
-        </w:rPr>
-      </w:pPr>
-      <w:r>
-        <w:rPr>
-          <w:rFonts w:ascii="Times New Roman" w:hAnsi="Times New Roman" w:cs="Times New Roman"/>
-          <w:b/>
-          <w:bCs/>
-        </w:rPr>
-        <w:lastRenderedPageBreak/>
+        <w:jc w:val="both"/>
+        <w:rPr>
+          <w:rFonts w:ascii="Times New Roman" w:hAnsi="Times New Roman" w:cs="Times New Roman"/>
+          <w:b/>
+          <w:bCs/>
+        </w:rPr>
+      </w:pPr>
+      <w:r>
+        <w:rPr>
+          <w:rFonts w:ascii="Times New Roman" w:hAnsi="Times New Roman" w:cs="Times New Roman"/>
+          <w:b/>
+          <w:bCs/>
+        </w:rPr>
         <w:t xml:space="preserve">4.3 </w:t>
       </w:r>
       <w:proofErr w:type="spellStart"/>
@@ -1121,6 +1370,7 @@
     <w:p>
       <w:pPr>
         <w:spacing w:line="276" w:lineRule="auto"/>
+        <w:jc w:val="both"/>
         <w:rPr>
           <w:rFonts w:ascii="Times New Roman" w:hAnsi="Times New Roman" w:cs="Times New Roman"/>
         </w:rPr>
@@ -1143,14 +1393,25 @@
     <w:p>
       <w:pPr>
         <w:spacing w:line="276" w:lineRule="auto"/>
-        <w:rPr>
-          <w:rFonts w:ascii="Times New Roman" w:hAnsi="Times New Roman" w:cs="Times New Roman"/>
-        </w:rPr>
-      </w:pPr>
-    </w:p>
-    <w:p>
-      <w:pPr>
-        <w:spacing w:line="276" w:lineRule="auto"/>
+        <w:jc w:val="both"/>
+        <w:rPr>
+          <w:rFonts w:ascii="Times New Roman" w:hAnsi="Times New Roman" w:cs="Times New Roman"/>
+        </w:rPr>
+      </w:pPr>
+    </w:p>
+    <w:p>
+      <w:pPr>
+        <w:spacing w:line="276" w:lineRule="auto"/>
+        <w:jc w:val="both"/>
+        <w:rPr>
+          <w:rFonts w:ascii="Times New Roman" w:hAnsi="Times New Roman" w:cs="Times New Roman"/>
+        </w:rPr>
+      </w:pPr>
+    </w:p>
+    <w:p>
+      <w:pPr>
+        <w:spacing w:line="276" w:lineRule="auto"/>
+        <w:jc w:val="both"/>
         <w:rPr>
           <w:rFonts w:ascii="Times New Roman" w:hAnsi="Times New Roman" w:cs="Times New Roman"/>
           <w:b/>
@@ -1187,6 +1448,7 @@
     <w:p>
       <w:pPr>
         <w:spacing w:line="276" w:lineRule="auto"/>
+        <w:jc w:val="both"/>
         <w:rPr>
           <w:rFonts w:ascii="Times New Roman" w:hAnsi="Times New Roman" w:cs="Times New Roman"/>
         </w:rPr>
@@ -1209,6 +1471,7 @@
     <w:p>
       <w:pPr>
         <w:spacing w:line="276" w:lineRule="auto"/>
+        <w:jc w:val="both"/>
         <w:rPr>
           <w:rFonts w:ascii="Times New Roman" w:hAnsi="Times New Roman" w:cs="Times New Roman"/>
         </w:rPr>
@@ -1227,6 +1490,7 @@
           <w:numId w:val="6"/>
         </w:numPr>
         <w:spacing w:line="276" w:lineRule="auto"/>
+        <w:jc w:val="both"/>
         <w:rPr>
           <w:rFonts w:ascii="Times New Roman" w:hAnsi="Times New Roman" w:cs="Times New Roman"/>
         </w:rPr>
@@ -1263,6 +1527,7 @@
           <w:numId w:val="6"/>
         </w:numPr>
         <w:spacing w:line="276" w:lineRule="auto"/>
+        <w:jc w:val="both"/>
         <w:rPr>
           <w:rFonts w:ascii="Times New Roman" w:hAnsi="Times New Roman" w:cs="Times New Roman"/>
         </w:rPr>
@@ -1299,6 +1564,7 @@
           <w:numId w:val="6"/>
         </w:numPr>
         <w:spacing w:line="276" w:lineRule="auto"/>
+        <w:jc w:val="both"/>
         <w:rPr>
           <w:rFonts w:ascii="Times New Roman" w:hAnsi="Times New Roman" w:cs="Times New Roman"/>
         </w:rPr>
@@ -1353,6 +1619,7 @@
           <w:numId w:val="6"/>
         </w:numPr>
         <w:spacing w:line="276" w:lineRule="auto"/>
+        <w:jc w:val="both"/>
         <w:rPr>
           <w:rFonts w:ascii="Times New Roman" w:hAnsi="Times New Roman" w:cs="Times New Roman"/>
         </w:rPr>
@@ -1407,6 +1674,7 @@
           <w:numId w:val="6"/>
         </w:numPr>
         <w:spacing w:line="276" w:lineRule="auto"/>
+        <w:jc w:val="both"/>
         <w:rPr>
           <w:rFonts w:ascii="Times New Roman" w:hAnsi="Times New Roman" w:cs="Times New Roman"/>
         </w:rPr>
@@ -1439,6 +1707,7 @@
     <w:p>
       <w:pPr>
         <w:spacing w:line="276" w:lineRule="auto"/>
+        <w:jc w:val="both"/>
         <w:rPr>
           <w:rFonts w:ascii="Times New Roman" w:hAnsi="Times New Roman" w:cs="Times New Roman"/>
         </w:rPr>
@@ -1495,6 +1764,7 @@
     <w:p>
       <w:pPr>
         <w:spacing w:line="276" w:lineRule="auto"/>
+        <w:jc w:val="both"/>
         <w:rPr>
           <w:rFonts w:ascii="Times New Roman" w:hAnsi="Times New Roman" w:cs="Times New Roman"/>
         </w:rPr>
@@ -1509,14 +1779,947 @@
     <w:p>
       <w:pPr>
         <w:spacing w:line="276" w:lineRule="auto"/>
-        <w:rPr>
-          <w:rFonts w:ascii="Times New Roman" w:hAnsi="Times New Roman" w:cs="Times New Roman"/>
-        </w:rPr>
-      </w:pPr>
-    </w:p>
-    <w:p>
-      <w:pPr>
-        <w:spacing w:line="276" w:lineRule="auto"/>
+        <w:jc w:val="both"/>
+        <w:rPr>
+          <w:rFonts w:ascii="Times New Roman" w:hAnsi="Times New Roman" w:cs="Times New Roman"/>
+        </w:rPr>
+      </w:pPr>
+    </w:p>
+    <w:p>
+      <w:pPr>
+        <w:spacing w:line="276" w:lineRule="auto"/>
+        <w:jc w:val="both"/>
+        <w:rPr>
+          <w:rFonts w:ascii="Times New Roman" w:hAnsi="Times New Roman" w:cs="Times New Roman"/>
+          <w:b/>
+          <w:bCs/>
+        </w:rPr>
+      </w:pPr>
+      <w:r>
+        <w:rPr>
+          <w:rFonts w:ascii="Times New Roman" w:hAnsi="Times New Roman" w:cs="Times New Roman"/>
+          <w:b/>
+          <w:bCs/>
+        </w:rPr>
+        <w:lastRenderedPageBreak/>
+        <w:t>6. Conclusiones</w:t>
+      </w:r>
+    </w:p>
+    <w:p>
+      <w:pPr>
+        <w:spacing w:line="276" w:lineRule="auto"/>
+        <w:jc w:val="both"/>
+        <w:rPr>
+          <w:rFonts w:ascii="Times New Roman" w:hAnsi="Times New Roman" w:cs="Times New Roman"/>
+        </w:rPr>
+      </w:pPr>
+      <w:r>
+        <w:rPr>
+          <w:rFonts w:ascii="Times New Roman" w:hAnsi="Times New Roman" w:cs="Times New Roman"/>
+        </w:rPr>
+        <w:t>El análisis realizado permitió identificar las principales funciones y los usuarios del sistema de gestión de rescates de animales. La definición de los requisitos ayuda a establecer qué debe hacer el sistema y cómo se organizará el trabajo del refugio.</w:t>
+      </w:r>
+    </w:p>
+    <w:p>
+      <w:pPr>
+        <w:spacing w:line="276" w:lineRule="auto"/>
+        <w:jc w:val="both"/>
+        <w:rPr>
+          <w:rFonts w:ascii="Times New Roman" w:hAnsi="Times New Roman" w:cs="Times New Roman"/>
+        </w:rPr>
+      </w:pPr>
+      <w:r>
+        <w:rPr>
+          <w:rFonts w:ascii="Times New Roman" w:hAnsi="Times New Roman" w:cs="Times New Roman"/>
+        </w:rPr>
+        <w:t xml:space="preserve">Los diagramas UML permiten representar de forma visual el funcionamiento del sistema y la relación entre sus elementos. Además, los patrones Factory Method, </w:t>
+      </w:r>
+      <w:proofErr w:type="spellStart"/>
+      <w:r>
+        <w:rPr>
+          <w:rFonts w:ascii="Times New Roman" w:hAnsi="Times New Roman" w:cs="Times New Roman"/>
+        </w:rPr>
+        <w:t>Observer</w:t>
+      </w:r>
+      <w:proofErr w:type="spellEnd"/>
+      <w:r>
+        <w:rPr>
+          <w:rFonts w:ascii="Times New Roman" w:hAnsi="Times New Roman" w:cs="Times New Roman"/>
+        </w:rPr>
+        <w:t xml:space="preserve"> y </w:t>
+      </w:r>
+      <w:proofErr w:type="spellStart"/>
+      <w:r>
+        <w:rPr>
+          <w:rFonts w:ascii="Times New Roman" w:hAnsi="Times New Roman" w:cs="Times New Roman"/>
+        </w:rPr>
+        <w:t>Adapter</w:t>
+      </w:r>
+      <w:proofErr w:type="spellEnd"/>
+      <w:r>
+        <w:rPr>
+          <w:rFonts w:ascii="Times New Roman" w:hAnsi="Times New Roman" w:cs="Times New Roman"/>
+        </w:rPr>
+        <w:t xml:space="preserve"> ofrecen alternativas para organizar la creación de animales, las notificaciones y la conexión con servicios externos.</w:t>
+      </w:r>
+    </w:p>
+    <w:p>
+      <w:pPr>
+        <w:spacing w:line="276" w:lineRule="auto"/>
+        <w:jc w:val="both"/>
+        <w:rPr>
+          <w:rFonts w:ascii="Times New Roman" w:hAnsi="Times New Roman" w:cs="Times New Roman"/>
+        </w:rPr>
+      </w:pPr>
+      <w:r>
+        <w:rPr>
+          <w:rFonts w:ascii="Times New Roman" w:hAnsi="Times New Roman" w:cs="Times New Roman"/>
+        </w:rPr>
+        <w:t xml:space="preserve">Finalmente, el uso de GitHub y del modelo </w:t>
+      </w:r>
+      <w:proofErr w:type="spellStart"/>
+      <w:r>
+        <w:rPr>
+          <w:rFonts w:ascii="Times New Roman" w:hAnsi="Times New Roman" w:cs="Times New Roman"/>
+        </w:rPr>
+        <w:t>Gitflow</w:t>
+      </w:r>
+      <w:proofErr w:type="spellEnd"/>
+      <w:r>
+        <w:rPr>
+          <w:rFonts w:ascii="Times New Roman" w:hAnsi="Times New Roman" w:cs="Times New Roman"/>
+        </w:rPr>
+        <w:t xml:space="preserve"> permite mantener un registro de los cambios realizados en el proyecto. Esto facilita el seguimiento de los avances y ayuda a conservar una versión organizada del trabajo.</w:t>
+      </w:r>
+    </w:p>
+    <w:p>
+      <w:pPr>
+        <w:spacing w:line="276" w:lineRule="auto"/>
+        <w:jc w:val="both"/>
+        <w:rPr>
+          <w:rFonts w:ascii="Times New Roman" w:hAnsi="Times New Roman" w:cs="Times New Roman"/>
+        </w:rPr>
+      </w:pPr>
+    </w:p>
+    <w:p>
+      <w:pPr>
+        <w:spacing w:line="276" w:lineRule="auto"/>
+        <w:jc w:val="both"/>
+        <w:rPr>
+          <w:rFonts w:ascii="Times New Roman" w:hAnsi="Times New Roman" w:cs="Times New Roman"/>
+        </w:rPr>
+      </w:pPr>
+    </w:p>
+    <w:p>
+      <w:pPr>
+        <w:spacing w:line="276" w:lineRule="auto"/>
+        <w:jc w:val="both"/>
+        <w:rPr>
+          <w:rFonts w:ascii="Times New Roman" w:hAnsi="Times New Roman" w:cs="Times New Roman"/>
+        </w:rPr>
+      </w:pPr>
+    </w:p>
+    <w:p>
+      <w:pPr>
+        <w:spacing w:line="276" w:lineRule="auto"/>
+        <w:jc w:val="both"/>
+        <w:rPr>
+          <w:rFonts w:ascii="Times New Roman" w:hAnsi="Times New Roman" w:cs="Times New Roman"/>
+        </w:rPr>
+      </w:pPr>
+    </w:p>
+    <w:p>
+      <w:pPr>
+        <w:spacing w:line="276" w:lineRule="auto"/>
+        <w:jc w:val="both"/>
+        <w:rPr>
+          <w:rFonts w:ascii="Times New Roman" w:hAnsi="Times New Roman" w:cs="Times New Roman"/>
+        </w:rPr>
+      </w:pPr>
+    </w:p>
+    <w:p>
+      <w:pPr>
+        <w:spacing w:line="276" w:lineRule="auto"/>
+        <w:jc w:val="both"/>
+        <w:rPr>
+          <w:rFonts w:ascii="Times New Roman" w:hAnsi="Times New Roman" w:cs="Times New Roman"/>
+        </w:rPr>
+      </w:pPr>
+    </w:p>
+    <w:p>
+      <w:pPr>
+        <w:spacing w:line="276" w:lineRule="auto"/>
+        <w:jc w:val="both"/>
+        <w:rPr>
+          <w:rFonts w:ascii="Times New Roman" w:hAnsi="Times New Roman" w:cs="Times New Roman"/>
+        </w:rPr>
+      </w:pPr>
+    </w:p>
+    <w:p>
+      <w:pPr>
+        <w:spacing w:line="276" w:lineRule="auto"/>
+        <w:jc w:val="both"/>
+        <w:rPr>
+          <w:rFonts w:ascii="Times New Roman" w:hAnsi="Times New Roman" w:cs="Times New Roman"/>
+        </w:rPr>
+      </w:pPr>
+    </w:p>
+    <w:p>
+      <w:pPr>
+        <w:spacing w:line="276" w:lineRule="auto"/>
+        <w:jc w:val="both"/>
+        <w:rPr>
+          <w:rFonts w:ascii="Times New Roman" w:hAnsi="Times New Roman" w:cs="Times New Roman"/>
+        </w:rPr>
+      </w:pPr>
+    </w:p>
+    <w:p>
+      <w:pPr>
+        <w:spacing w:line="276" w:lineRule="auto"/>
+        <w:jc w:val="both"/>
+        <w:rPr>
+          <w:rFonts w:ascii="Times New Roman" w:hAnsi="Times New Roman" w:cs="Times New Roman"/>
+        </w:rPr>
+      </w:pPr>
+    </w:p>
+    <w:p>
+      <w:pPr>
+        <w:spacing w:line="276" w:lineRule="auto"/>
+        <w:jc w:val="both"/>
+        <w:rPr>
+          <w:rFonts w:ascii="Times New Roman" w:hAnsi="Times New Roman" w:cs="Times New Roman"/>
+        </w:rPr>
+      </w:pPr>
+    </w:p>
+    <w:p>
+      <w:pPr>
+        <w:spacing w:line="276" w:lineRule="auto"/>
+        <w:jc w:val="both"/>
+        <w:rPr>
+          <w:rFonts w:ascii="Times New Roman" w:hAnsi="Times New Roman" w:cs="Times New Roman"/>
+        </w:rPr>
+      </w:pPr>
+    </w:p>
+    <w:p>
+      <w:pPr>
+        <w:spacing w:line="276" w:lineRule="auto"/>
+        <w:jc w:val="both"/>
+        <w:rPr>
+          <w:rFonts w:ascii="Times New Roman" w:hAnsi="Times New Roman" w:cs="Times New Roman"/>
+        </w:rPr>
+      </w:pPr>
+    </w:p>
+    <w:p>
+      <w:pPr>
+        <w:spacing w:line="276" w:lineRule="auto"/>
+        <w:jc w:val="both"/>
+        <w:rPr>
+          <w:rFonts w:ascii="Times New Roman" w:hAnsi="Times New Roman" w:cs="Times New Roman"/>
+        </w:rPr>
+      </w:pPr>
+    </w:p>
+    <w:p>
+      <w:pPr>
+        <w:spacing w:line="276" w:lineRule="auto"/>
+        <w:jc w:val="both"/>
+        <w:rPr>
+          <w:rFonts w:ascii="Times New Roman" w:hAnsi="Times New Roman" w:cs="Times New Roman"/>
+        </w:rPr>
+      </w:pPr>
+    </w:p>
+    <w:p>
+      <w:pPr>
+        <w:spacing w:line="276" w:lineRule="auto"/>
+        <w:jc w:val="both"/>
+        <w:rPr>
+          <w:rFonts w:ascii="Times New Roman" w:hAnsi="Times New Roman" w:cs="Times New Roman"/>
+        </w:rPr>
+      </w:pPr>
+    </w:p>
+    <w:p>
+      <w:pPr>
+        <w:spacing w:line="276" w:lineRule="auto"/>
+        <w:jc w:val="both"/>
+        <w:rPr>
+          <w:rFonts w:ascii="Times New Roman" w:hAnsi="Times New Roman" w:cs="Times New Roman"/>
+        </w:rPr>
+      </w:pPr>
+    </w:p>
+    <w:p>
+      <w:pPr>
+        <w:spacing w:line="276" w:lineRule="auto"/>
+        <w:jc w:val="both"/>
+        <w:rPr>
+          <w:rFonts w:ascii="Times New Roman" w:hAnsi="Times New Roman" w:cs="Times New Roman"/>
+        </w:rPr>
+      </w:pPr>
+    </w:p>
+    <w:p>
+      <w:pPr>
+        <w:spacing w:line="276" w:lineRule="auto"/>
+        <w:jc w:val="both"/>
+        <w:rPr>
+          <w:rFonts w:ascii="Times New Roman" w:hAnsi="Times New Roman" w:cs="Times New Roman"/>
+        </w:rPr>
+      </w:pPr>
+    </w:p>
+    <w:p>
+      <w:pPr>
+        <w:spacing w:line="276" w:lineRule="auto"/>
+        <w:jc w:val="both"/>
+        <w:rPr>
+          <w:rFonts w:ascii="Times New Roman" w:hAnsi="Times New Roman" w:cs="Times New Roman"/>
+        </w:rPr>
+      </w:pPr>
+    </w:p>
+    <w:p>
+      <w:pPr>
+        <w:spacing w:line="276" w:lineRule="auto"/>
+        <w:jc w:val="both"/>
+        <w:rPr>
+          <w:rFonts w:ascii="Times New Roman" w:hAnsi="Times New Roman" w:cs="Times New Roman"/>
+        </w:rPr>
+      </w:pPr>
+    </w:p>
+    <w:p>
+      <w:pPr>
+        <w:spacing w:line="276" w:lineRule="auto"/>
+        <w:jc w:val="both"/>
+        <w:rPr>
+          <w:rFonts w:ascii="Times New Roman" w:hAnsi="Times New Roman" w:cs="Times New Roman"/>
+          <w:b/>
+          <w:bCs/>
+        </w:rPr>
+      </w:pPr>
+      <w:r>
+        <w:rPr>
+          <w:rFonts w:ascii="Times New Roman" w:hAnsi="Times New Roman" w:cs="Times New Roman"/>
+          <w:b/>
+          <w:bCs/>
+        </w:rPr>
+        <w:lastRenderedPageBreak/>
+        <w:t>7. Referencias bibliográficas</w:t>
+      </w:r>
+    </w:p>
+    <w:p>
+      <w:pPr>
+        <w:spacing w:line="276" w:lineRule="auto"/>
+        <w:jc w:val="both"/>
+        <w:rPr>
+          <w:rFonts w:ascii="Times New Roman" w:hAnsi="Times New Roman" w:cs="Times New Roman"/>
+          <w:b/>
+          <w:bCs/>
+        </w:rPr>
+      </w:pPr>
+    </w:p>
+    <w:p>
+      <w:pPr>
+        <w:spacing w:line="480" w:lineRule="auto"/>
+        <w:ind w:left="709" w:hanging="709"/>
+        <w:rPr>
+          <w:rFonts w:ascii="Times New Roman" w:hAnsi="Times New Roman" w:cs="Times New Roman"/>
+        </w:rPr>
+      </w:pPr>
+      <w:proofErr w:type="spellStart"/>
+      <w:r>
+        <w:rPr>
+          <w:rFonts w:ascii="Times New Roman" w:hAnsi="Times New Roman" w:cs="Times New Roman"/>
+        </w:rPr>
+        <w:t>Object</w:t>
+      </w:r>
+      <w:proofErr w:type="spellEnd"/>
+      <w:r>
+        <w:rPr>
+          <w:rFonts w:ascii="Times New Roman" w:hAnsi="Times New Roman" w:cs="Times New Roman"/>
+        </w:rPr>
+        <w:t xml:space="preserve"> Management Group. (2017). </w:t>
+      </w:r>
+      <w:proofErr w:type="spellStart"/>
+      <w:r>
+        <w:rPr>
+          <w:rFonts w:ascii="Times New Roman" w:hAnsi="Times New Roman" w:cs="Times New Roman"/>
+          <w:i/>
+          <w:iCs/>
+        </w:rPr>
+        <w:t>About</w:t>
+      </w:r>
+      <w:proofErr w:type="spellEnd"/>
+      <w:r>
+        <w:rPr>
+          <w:rFonts w:ascii="Times New Roman" w:hAnsi="Times New Roman" w:cs="Times New Roman"/>
+          <w:i/>
+          <w:iCs/>
+        </w:rPr>
+        <w:t xml:space="preserve"> </w:t>
+      </w:r>
+      <w:proofErr w:type="spellStart"/>
+      <w:r>
+        <w:rPr>
+          <w:rFonts w:ascii="Times New Roman" w:hAnsi="Times New Roman" w:cs="Times New Roman"/>
+          <w:i/>
+          <w:iCs/>
+        </w:rPr>
+        <w:t>the</w:t>
+      </w:r>
+      <w:proofErr w:type="spellEnd"/>
+      <w:r>
+        <w:rPr>
+          <w:rFonts w:ascii="Times New Roman" w:hAnsi="Times New Roman" w:cs="Times New Roman"/>
+          <w:i/>
+          <w:iCs/>
+        </w:rPr>
+        <w:t xml:space="preserve"> </w:t>
+      </w:r>
+      <w:proofErr w:type="spellStart"/>
+      <w:r>
+        <w:rPr>
+          <w:rFonts w:ascii="Times New Roman" w:hAnsi="Times New Roman" w:cs="Times New Roman"/>
+          <w:i/>
+          <w:iCs/>
+        </w:rPr>
+        <w:t>Unified</w:t>
+      </w:r>
+      <w:proofErr w:type="spellEnd"/>
+      <w:r>
+        <w:rPr>
+          <w:rFonts w:ascii="Times New Roman" w:hAnsi="Times New Roman" w:cs="Times New Roman"/>
+          <w:i/>
+          <w:iCs/>
+        </w:rPr>
+        <w:t xml:space="preserve"> </w:t>
+      </w:r>
+      <w:proofErr w:type="spellStart"/>
+      <w:r>
+        <w:rPr>
+          <w:rFonts w:ascii="Times New Roman" w:hAnsi="Times New Roman" w:cs="Times New Roman"/>
+          <w:i/>
+          <w:iCs/>
+        </w:rPr>
+        <w:t>Modeling</w:t>
+      </w:r>
+      <w:proofErr w:type="spellEnd"/>
+      <w:r>
+        <w:rPr>
+          <w:rFonts w:ascii="Times New Roman" w:hAnsi="Times New Roman" w:cs="Times New Roman"/>
+          <w:i/>
+          <w:iCs/>
+        </w:rPr>
+        <w:t xml:space="preserve"> </w:t>
+      </w:r>
+      <w:proofErr w:type="spellStart"/>
+      <w:r>
+        <w:rPr>
+          <w:rFonts w:ascii="Times New Roman" w:hAnsi="Times New Roman" w:cs="Times New Roman"/>
+          <w:i/>
+          <w:iCs/>
+        </w:rPr>
+        <w:t>Language</w:t>
+      </w:r>
+      <w:proofErr w:type="spellEnd"/>
+      <w:r>
+        <w:rPr>
+          <w:rFonts w:ascii="Times New Roman" w:hAnsi="Times New Roman" w:cs="Times New Roman"/>
+          <w:i/>
+          <w:iCs/>
+        </w:rPr>
+        <w:t xml:space="preserve"> </w:t>
+      </w:r>
+      <w:proofErr w:type="spellStart"/>
+      <w:r>
+        <w:rPr>
+          <w:rFonts w:ascii="Times New Roman" w:hAnsi="Times New Roman" w:cs="Times New Roman"/>
+          <w:i/>
+          <w:iCs/>
+        </w:rPr>
+        <w:t>specification</w:t>
+      </w:r>
+      <w:proofErr w:type="spellEnd"/>
+      <w:r>
+        <w:rPr>
+          <w:rFonts w:ascii="Times New Roman" w:hAnsi="Times New Roman" w:cs="Times New Roman"/>
+          <w:i/>
+          <w:iCs/>
+        </w:rPr>
+        <w:t xml:space="preserve"> </w:t>
+      </w:r>
+      <w:proofErr w:type="spellStart"/>
+      <w:r>
+        <w:rPr>
+          <w:rFonts w:ascii="Times New Roman" w:hAnsi="Times New Roman" w:cs="Times New Roman"/>
+          <w:i/>
+          <w:iCs/>
+        </w:rPr>
+        <w:t>version</w:t>
+      </w:r>
+      <w:proofErr w:type="spellEnd"/>
+      <w:r>
+        <w:rPr>
+          <w:rFonts w:ascii="Times New Roman" w:hAnsi="Times New Roman" w:cs="Times New Roman"/>
+          <w:i/>
+          <w:iCs/>
+        </w:rPr>
+        <w:t xml:space="preserve"> 2.5.1</w:t>
+      </w:r>
+      <w:r>
+        <w:rPr>
+          <w:rFonts w:ascii="Times New Roman" w:hAnsi="Times New Roman" w:cs="Times New Roman"/>
+        </w:rPr>
+        <w:t xml:space="preserve">. </w:t>
+      </w:r>
+      <w:hyperlink r:id="rId7" w:history="1">
+        <w:r>
+          <w:rPr>
+            <w:rStyle w:val="Hipervnculo"/>
+            <w:rFonts w:ascii="Times New Roman" w:hAnsi="Times New Roman" w:cs="Times New Roman"/>
+          </w:rPr>
+          <w:t>https://www.omg.org/spec/UML/About-UML/</w:t>
+        </w:r>
+      </w:hyperlink>
+    </w:p>
+    <w:p>
+      <w:pPr>
+        <w:spacing w:line="480" w:lineRule="auto"/>
+        <w:ind w:left="709" w:hanging="709"/>
+        <w:rPr>
+          <w:rFonts w:ascii="Times New Roman" w:hAnsi="Times New Roman" w:cs="Times New Roman"/>
+        </w:rPr>
+      </w:pPr>
+      <w:r>
+        <w:rPr>
+          <w:rFonts w:ascii="Times New Roman" w:hAnsi="Times New Roman" w:cs="Times New Roman"/>
+        </w:rPr>
+        <w:t xml:space="preserve">Gamma, E., Helm, R., Johnson, R., &amp; </w:t>
+      </w:r>
+      <w:proofErr w:type="spellStart"/>
+      <w:r>
+        <w:rPr>
+          <w:rFonts w:ascii="Times New Roman" w:hAnsi="Times New Roman" w:cs="Times New Roman"/>
+        </w:rPr>
+        <w:t>Vlissides</w:t>
+      </w:r>
+      <w:proofErr w:type="spellEnd"/>
+      <w:r>
+        <w:rPr>
+          <w:rFonts w:ascii="Times New Roman" w:hAnsi="Times New Roman" w:cs="Times New Roman"/>
+        </w:rPr>
+        <w:t xml:space="preserve">, J. (1994). </w:t>
+      </w:r>
+      <w:proofErr w:type="spellStart"/>
+      <w:r>
+        <w:rPr>
+          <w:rFonts w:ascii="Times New Roman" w:hAnsi="Times New Roman" w:cs="Times New Roman"/>
+          <w:i/>
+          <w:iCs/>
+        </w:rPr>
+        <w:t>Design</w:t>
+      </w:r>
+      <w:proofErr w:type="spellEnd"/>
+      <w:r>
+        <w:rPr>
+          <w:rFonts w:ascii="Times New Roman" w:hAnsi="Times New Roman" w:cs="Times New Roman"/>
+          <w:i/>
+          <w:iCs/>
+        </w:rPr>
+        <w:t xml:space="preserve"> </w:t>
+      </w:r>
+      <w:proofErr w:type="spellStart"/>
+      <w:r>
+        <w:rPr>
+          <w:rFonts w:ascii="Times New Roman" w:hAnsi="Times New Roman" w:cs="Times New Roman"/>
+          <w:i/>
+          <w:iCs/>
+        </w:rPr>
+        <w:t>patterns</w:t>
+      </w:r>
+      <w:proofErr w:type="spellEnd"/>
+      <w:r>
+        <w:rPr>
+          <w:rFonts w:ascii="Times New Roman" w:hAnsi="Times New Roman" w:cs="Times New Roman"/>
+          <w:i/>
+          <w:iCs/>
+        </w:rPr>
+        <w:t xml:space="preserve">: </w:t>
+      </w:r>
+      <w:proofErr w:type="spellStart"/>
+      <w:r>
+        <w:rPr>
+          <w:rFonts w:ascii="Times New Roman" w:hAnsi="Times New Roman" w:cs="Times New Roman"/>
+          <w:i/>
+          <w:iCs/>
+        </w:rPr>
+        <w:t>Elements</w:t>
+      </w:r>
+      <w:proofErr w:type="spellEnd"/>
+      <w:r>
+        <w:rPr>
+          <w:rFonts w:ascii="Times New Roman" w:hAnsi="Times New Roman" w:cs="Times New Roman"/>
+          <w:i/>
+          <w:iCs/>
+        </w:rPr>
+        <w:t xml:space="preserve"> </w:t>
+      </w:r>
+      <w:proofErr w:type="spellStart"/>
+      <w:r>
+        <w:rPr>
+          <w:rFonts w:ascii="Times New Roman" w:hAnsi="Times New Roman" w:cs="Times New Roman"/>
+          <w:i/>
+          <w:iCs/>
+        </w:rPr>
+        <w:t>of</w:t>
+      </w:r>
+      <w:proofErr w:type="spellEnd"/>
+      <w:r>
+        <w:rPr>
+          <w:rFonts w:ascii="Times New Roman" w:hAnsi="Times New Roman" w:cs="Times New Roman"/>
+          <w:i/>
+          <w:iCs/>
+        </w:rPr>
+        <w:t xml:space="preserve"> reusable </w:t>
+      </w:r>
+      <w:proofErr w:type="spellStart"/>
+      <w:r>
+        <w:rPr>
+          <w:rFonts w:ascii="Times New Roman" w:hAnsi="Times New Roman" w:cs="Times New Roman"/>
+          <w:i/>
+          <w:iCs/>
+        </w:rPr>
+        <w:t>object-oriented</w:t>
+      </w:r>
+      <w:proofErr w:type="spellEnd"/>
+      <w:r>
+        <w:rPr>
+          <w:rFonts w:ascii="Times New Roman" w:hAnsi="Times New Roman" w:cs="Times New Roman"/>
+          <w:i/>
+          <w:iCs/>
+        </w:rPr>
+        <w:t xml:space="preserve"> software</w:t>
+      </w:r>
+      <w:r>
+        <w:rPr>
+          <w:rFonts w:ascii="Times New Roman" w:hAnsi="Times New Roman" w:cs="Times New Roman"/>
+        </w:rPr>
+        <w:t xml:space="preserve">. Addison-Wesley Professional. </w:t>
+      </w:r>
+      <w:hyperlink r:id="rId8" w:history="1">
+        <w:r>
+          <w:rPr>
+            <w:rStyle w:val="Hipervnculo"/>
+            <w:rFonts w:ascii="Times New Roman" w:hAnsi="Times New Roman" w:cs="Times New Roman"/>
+          </w:rPr>
+          <w:t>https://www.pearson.com/en-us/subject-catalog/p/design-patterns-elements-of-reusable-object-oriented-software/P200000009480/9780201633610</w:t>
+        </w:r>
+      </w:hyperlink>
+    </w:p>
+    <w:p>
+      <w:pPr>
+        <w:spacing w:line="480" w:lineRule="auto"/>
+        <w:ind w:left="709" w:hanging="709"/>
+        <w:rPr>
+          <w:rFonts w:ascii="Times New Roman" w:hAnsi="Times New Roman" w:cs="Times New Roman"/>
+        </w:rPr>
+      </w:pPr>
+      <w:r>
+        <w:rPr>
+          <w:rFonts w:ascii="Times New Roman" w:hAnsi="Times New Roman" w:cs="Times New Roman"/>
+        </w:rPr>
+        <w:t xml:space="preserve">Haigh, F. (2023, 5 de junio). </w:t>
+      </w:r>
+      <w:r>
+        <w:rPr>
+          <w:rFonts w:ascii="Times New Roman" w:hAnsi="Times New Roman" w:cs="Times New Roman"/>
+          <w:i/>
+          <w:iCs/>
+        </w:rPr>
+        <w:t xml:space="preserve">SRS - Software </w:t>
+      </w:r>
+      <w:proofErr w:type="spellStart"/>
+      <w:r>
+        <w:rPr>
+          <w:rFonts w:ascii="Times New Roman" w:hAnsi="Times New Roman" w:cs="Times New Roman"/>
+          <w:i/>
+          <w:iCs/>
+        </w:rPr>
+        <w:t>Requirements</w:t>
+      </w:r>
+      <w:proofErr w:type="spellEnd"/>
+      <w:r>
+        <w:rPr>
+          <w:rFonts w:ascii="Times New Roman" w:hAnsi="Times New Roman" w:cs="Times New Roman"/>
+          <w:i/>
+          <w:iCs/>
+        </w:rPr>
+        <w:t xml:space="preserve"> </w:t>
+      </w:r>
+      <w:proofErr w:type="spellStart"/>
+      <w:r>
+        <w:rPr>
+          <w:rFonts w:ascii="Times New Roman" w:hAnsi="Times New Roman" w:cs="Times New Roman"/>
+          <w:i/>
+          <w:iCs/>
+        </w:rPr>
+        <w:t>Specification</w:t>
+      </w:r>
+      <w:proofErr w:type="spellEnd"/>
+      <w:r>
+        <w:rPr>
+          <w:rFonts w:ascii="Times New Roman" w:hAnsi="Times New Roman" w:cs="Times New Roman"/>
+        </w:rPr>
+        <w:t xml:space="preserve">. NASA Software </w:t>
+      </w:r>
+      <w:proofErr w:type="spellStart"/>
+      <w:r>
+        <w:rPr>
+          <w:rFonts w:ascii="Times New Roman" w:hAnsi="Times New Roman" w:cs="Times New Roman"/>
+        </w:rPr>
+        <w:t>Engineering</w:t>
+      </w:r>
+      <w:proofErr w:type="spellEnd"/>
+      <w:r>
+        <w:rPr>
+          <w:rFonts w:ascii="Times New Roman" w:hAnsi="Times New Roman" w:cs="Times New Roman"/>
+        </w:rPr>
+        <w:t xml:space="preserve"> </w:t>
+      </w:r>
+      <w:proofErr w:type="spellStart"/>
+      <w:r>
+        <w:rPr>
+          <w:rFonts w:ascii="Times New Roman" w:hAnsi="Times New Roman" w:cs="Times New Roman"/>
+        </w:rPr>
+        <w:t>Handbook</w:t>
+      </w:r>
+      <w:proofErr w:type="spellEnd"/>
+      <w:r>
+        <w:rPr>
+          <w:rFonts w:ascii="Times New Roman" w:hAnsi="Times New Roman" w:cs="Times New Roman"/>
+        </w:rPr>
+        <w:t xml:space="preserve">. </w:t>
+      </w:r>
+      <w:hyperlink r:id="rId9" w:history="1">
+        <w:r>
+          <w:rPr>
+            <w:rStyle w:val="Hipervnculo"/>
+            <w:rFonts w:ascii="Times New Roman" w:hAnsi="Times New Roman" w:cs="Times New Roman"/>
+          </w:rPr>
+          <w:t>https://swehb.nasa.gov/spaces/SWEHBVB/pages/32604425/SRS%2B-%2BSoftware%2BRequirements%2BSpecification</w:t>
+        </w:r>
+      </w:hyperlink>
+    </w:p>
+    <w:p>
+      <w:pPr>
+        <w:spacing w:line="480" w:lineRule="auto"/>
+        <w:ind w:left="709" w:hanging="709"/>
+        <w:rPr>
+          <w:rFonts w:ascii="Times New Roman" w:hAnsi="Times New Roman" w:cs="Times New Roman"/>
+        </w:rPr>
+      </w:pPr>
+      <w:r>
+        <w:rPr>
+          <w:rFonts w:ascii="Times New Roman" w:hAnsi="Times New Roman" w:cs="Times New Roman"/>
+        </w:rPr>
+        <w:t xml:space="preserve">Driessen, V. (2010, 5 de enero). </w:t>
+      </w:r>
+      <w:r>
+        <w:rPr>
+          <w:rFonts w:ascii="Times New Roman" w:hAnsi="Times New Roman" w:cs="Times New Roman"/>
+          <w:i/>
+          <w:iCs/>
+        </w:rPr>
+        <w:t xml:space="preserve">A </w:t>
+      </w:r>
+      <w:proofErr w:type="spellStart"/>
+      <w:r>
+        <w:rPr>
+          <w:rFonts w:ascii="Times New Roman" w:hAnsi="Times New Roman" w:cs="Times New Roman"/>
+          <w:i/>
+          <w:iCs/>
+        </w:rPr>
+        <w:t>successful</w:t>
+      </w:r>
+      <w:proofErr w:type="spellEnd"/>
+      <w:r>
+        <w:rPr>
+          <w:rFonts w:ascii="Times New Roman" w:hAnsi="Times New Roman" w:cs="Times New Roman"/>
+          <w:i/>
+          <w:iCs/>
+        </w:rPr>
+        <w:t xml:space="preserve"> Git </w:t>
+      </w:r>
+      <w:proofErr w:type="spellStart"/>
+      <w:r>
+        <w:rPr>
+          <w:rFonts w:ascii="Times New Roman" w:hAnsi="Times New Roman" w:cs="Times New Roman"/>
+          <w:i/>
+          <w:iCs/>
+        </w:rPr>
+        <w:t>branching</w:t>
+      </w:r>
+      <w:proofErr w:type="spellEnd"/>
+      <w:r>
+        <w:rPr>
+          <w:rFonts w:ascii="Times New Roman" w:hAnsi="Times New Roman" w:cs="Times New Roman"/>
+          <w:i/>
+          <w:iCs/>
+        </w:rPr>
+        <w:t xml:space="preserve"> </w:t>
+      </w:r>
+      <w:proofErr w:type="spellStart"/>
+      <w:r>
+        <w:rPr>
+          <w:rFonts w:ascii="Times New Roman" w:hAnsi="Times New Roman" w:cs="Times New Roman"/>
+          <w:i/>
+          <w:iCs/>
+        </w:rPr>
+        <w:t>model</w:t>
+      </w:r>
+      <w:proofErr w:type="spellEnd"/>
+      <w:r>
+        <w:rPr>
+          <w:rFonts w:ascii="Times New Roman" w:hAnsi="Times New Roman" w:cs="Times New Roman"/>
+        </w:rPr>
+        <w:t xml:space="preserve">. </w:t>
+      </w:r>
+      <w:hyperlink r:id="rId10" w:history="1">
+        <w:r>
+          <w:rPr>
+            <w:rStyle w:val="Hipervnculo"/>
+            <w:rFonts w:ascii="Times New Roman" w:hAnsi="Times New Roman" w:cs="Times New Roman"/>
+          </w:rPr>
+          <w:t>https://nvie.com/posts/a-successful-git-branching-model/</w:t>
+        </w:r>
+      </w:hyperlink>
+    </w:p>
+    <w:p>
+      <w:pPr>
+        <w:spacing w:line="276" w:lineRule="auto"/>
+        <w:jc w:val="both"/>
+        <w:rPr>
+          <w:rFonts w:ascii="Times New Roman" w:hAnsi="Times New Roman" w:cs="Times New Roman"/>
+        </w:rPr>
+      </w:pPr>
+    </w:p>
+    <w:p>
+      <w:pPr>
+        <w:spacing w:line="276" w:lineRule="auto"/>
+        <w:jc w:val="both"/>
+        <w:rPr>
+          <w:rFonts w:ascii="Times New Roman" w:hAnsi="Times New Roman" w:cs="Times New Roman"/>
+        </w:rPr>
+      </w:pPr>
+    </w:p>
+    <w:p>
+      <w:pPr>
+        <w:spacing w:line="276" w:lineRule="auto"/>
+        <w:jc w:val="both"/>
+        <w:rPr>
+          <w:rFonts w:ascii="Times New Roman" w:hAnsi="Times New Roman" w:cs="Times New Roman"/>
+        </w:rPr>
+      </w:pPr>
+    </w:p>
+    <w:p>
+      <w:pPr>
+        <w:spacing w:line="276" w:lineRule="auto"/>
+        <w:jc w:val="both"/>
+        <w:rPr>
+          <w:rFonts w:ascii="Times New Roman" w:hAnsi="Times New Roman" w:cs="Times New Roman"/>
+        </w:rPr>
+      </w:pPr>
+    </w:p>
+    <w:p>
+      <w:pPr>
+        <w:spacing w:line="276" w:lineRule="auto"/>
+        <w:jc w:val="both"/>
+        <w:rPr>
+          <w:rFonts w:ascii="Times New Roman" w:hAnsi="Times New Roman" w:cs="Times New Roman"/>
+        </w:rPr>
+      </w:pPr>
+    </w:p>
+    <w:p>
+      <w:pPr>
+        <w:spacing w:line="276" w:lineRule="auto"/>
+        <w:jc w:val="both"/>
+        <w:rPr>
+          <w:rFonts w:ascii="Times New Roman" w:hAnsi="Times New Roman" w:cs="Times New Roman"/>
+        </w:rPr>
+      </w:pPr>
+    </w:p>
+    <w:p>
+      <w:pPr>
+        <w:spacing w:line="276" w:lineRule="auto"/>
+        <w:jc w:val="both"/>
+        <w:rPr>
+          <w:rFonts w:ascii="Times New Roman" w:hAnsi="Times New Roman" w:cs="Times New Roman"/>
+        </w:rPr>
+      </w:pPr>
+    </w:p>
+    <w:p>
+      <w:pPr>
+        <w:spacing w:line="276" w:lineRule="auto"/>
+        <w:jc w:val="both"/>
+        <w:rPr>
+          <w:rFonts w:ascii="Times New Roman" w:hAnsi="Times New Roman" w:cs="Times New Roman"/>
+        </w:rPr>
+      </w:pPr>
+    </w:p>
+    <w:p>
+      <w:pPr>
+        <w:spacing w:line="276" w:lineRule="auto"/>
+        <w:jc w:val="both"/>
+        <w:rPr>
+          <w:rFonts w:ascii="Times New Roman" w:hAnsi="Times New Roman" w:cs="Times New Roman"/>
+        </w:rPr>
+      </w:pPr>
+    </w:p>
+    <w:p>
+      <w:pPr>
+        <w:spacing w:line="276" w:lineRule="auto"/>
+        <w:jc w:val="both"/>
+        <w:rPr>
+          <w:rFonts w:ascii="Times New Roman" w:hAnsi="Times New Roman" w:cs="Times New Roman"/>
+        </w:rPr>
+      </w:pPr>
+    </w:p>
+    <w:p>
+      <w:pPr>
+        <w:spacing w:line="276" w:lineRule="auto"/>
+        <w:jc w:val="both"/>
+        <w:rPr>
+          <w:rFonts w:ascii="Times New Roman" w:hAnsi="Times New Roman" w:cs="Times New Roman"/>
+        </w:rPr>
+      </w:pPr>
+    </w:p>
+    <w:p>
+      <w:pPr>
+        <w:spacing w:line="276" w:lineRule="auto"/>
+        <w:jc w:val="both"/>
+        <w:rPr>
+          <w:rFonts w:ascii="Times New Roman" w:hAnsi="Times New Roman" w:cs="Times New Roman"/>
+        </w:rPr>
+      </w:pPr>
+    </w:p>
+    <w:p>
+      <w:pPr>
+        <w:spacing w:line="276" w:lineRule="auto"/>
+        <w:jc w:val="both"/>
+        <w:rPr>
+          <w:rFonts w:ascii="Times New Roman" w:hAnsi="Times New Roman" w:cs="Times New Roman"/>
+          <w:b/>
+          <w:bCs/>
+        </w:rPr>
+      </w:pPr>
+      <w:r>
+        <w:rPr>
+          <w:rFonts w:ascii="Times New Roman" w:hAnsi="Times New Roman" w:cs="Times New Roman"/>
+          <w:b/>
+          <w:bCs/>
+        </w:rPr>
+        <w:lastRenderedPageBreak/>
+        <w:t>8. Anexos</w:t>
+      </w:r>
+    </w:p>
+    <w:p>
+      <w:pPr>
+        <w:spacing w:line="276" w:lineRule="auto"/>
+        <w:jc w:val="both"/>
         <w:rPr>
           <w:rFonts w:ascii="Times New Roman" w:hAnsi="Times New Roman" w:cs="Times New Roman"/>
         </w:rPr>
@@ -3245,6 +4448,29 @@
       <w:spacing w:val="5"/>
     </w:rPr>
   </w:style>
+  <w:style w:type="character" w:styleId="Hipervnculo">
+    <w:name w:val="Hyperlink"/>
+    <w:basedOn w:val="Fuentedeprrafopredeter"/>
+    <w:uiPriority w:val="99"/>
+    <w:unhideWhenUsed/>
+    <w:rsid w:val="00222952"/>
+    <w:rPr>
+      <w:color w:val="467886" w:themeColor="hyperlink"/>
+      <w:u w:val="single"/>
+    </w:rPr>
+  </w:style>
+  <w:style w:type="character" w:styleId="Mencinsinresolver">
+    <w:name w:val="Unresolved Mention"/>
+    <w:basedOn w:val="Fuentedeprrafopredeter"/>
+    <w:uiPriority w:val="99"/>
+    <w:semiHidden/>
+    <w:unhideWhenUsed/>
+    <w:rsid w:val="00222952"/>
+    <w:rPr>
+      <w:color w:val="605E5C"/>
+      <w:shd w:val="clear" w:color="auto" w:fill="E1DFDD"/>
+    </w:rPr>
+  </w:style>
 </w:styles>
 </file>
 

</xml_diff>